<commit_message>
Fix label overlaps in the figures after the font increase
Calibration, region, pass-rate, circuit, speed-trap, rules, time-step, what-if and workflow figures redrawn so no label sits on data or another label; report PDF and Word copy rebuilt.
</commit_message>
<xml_diff>
--- a/docs/project_documentation.docx
+++ b/docs/project_documentation.docx
@@ -1681,7 +1681,7 @@
       <w:r>
         <w:drawing>
           <wp:inline>
-            <wp:extent cx="5403690" cy="2127473"/>
+            <wp:extent cx="5339360" cy="2127473"/>
             <wp:effectExtent b="0" l="0" r="0" t="0"/>
             <wp:docPr descr="Workflow" title="" id="14" name="Picture"/>
             <a:graphic>
@@ -1702,7 +1702,7 @@
                   <pic:spPr bwMode="auto">
                     <a:xfrm>
                       <a:off x="0" y="0"/>
-                      <a:ext cx="5403690" cy="2127473"/>
+                      <a:ext cx="5339360" cy="2127473"/>
                     </a:xfrm>
                     <a:prstGeom prst="rect">
                       <a:avLst/>
@@ -12499,7 +12499,7 @@
       <w:r>
         <w:drawing>
           <wp:inline>
-            <wp:extent cx="6261100" cy="3840141"/>
+            <wp:extent cx="6261100" cy="3756660"/>
             <wp:effectExtent b="0" l="0" r="0" t="0"/>
             <wp:docPr descr="Circuits" title="" id="92" name="Picture"/>
             <a:graphic>
@@ -12520,7 +12520,7 @@
                   <pic:spPr bwMode="auto">
                     <a:xfrm>
                       <a:off x="0" y="0"/>
-                      <a:ext cx="6261100" cy="3840141"/>
+                      <a:ext cx="6261100" cy="3756660"/>
                     </a:xfrm>
                     <a:prstGeom prst="rect">
                       <a:avLst/>

</xml_diff>

<commit_message>
Add an interactive calculator in the browser (python -m overtake.app)
A small standard-library web server serves one page with a control for each of the 19 inputs and shows P(overtake), P without Boost, the chance at other gaps and any out-of-range warnings from the trained network. Corner and wet-weather defaults match the command line. Four tests cover input conversion, Overtake Mode on auto, error reporting and an HTTP round trip (88 tests in all). README, report Appendix D, API docs and test report updated.
</commit_message>
<xml_diff>
--- a/docs/project_documentation.docx
+++ b/docs/project_documentation.docx
@@ -4421,7 +4421,7 @@
         <w:t xml:space="preserve"> </w:t>
       </w:r>
       <w:r>
-        <w:t xml:space="preserve">data); 84 pytest tests cover the numerics, pipeline and notebooks, and</w:t>
+        <w:t xml:space="preserve">data); 88 pytest tests cover the numerics, pipeline and notebooks, and</w:t>
       </w:r>
       <w:r>
         <w:t xml:space="preserve"> </w:t>
@@ -8614,7 +8614,7 @@
               <w:rPr>
                 <w:sz w:val="17"/>
               </w:rPr>
-              <w:t xml:space="preserve">84 tests; exact-solution, convergence and stability studies; numbers regenerated by code</w:t>
+              <w:t xml:space="preserve">88 tests; exact-solution, convergence and stability studies; numbers regenerated by code</w:t>
             </w:r>
           </w:p>
         </w:tc>
@@ -13504,6 +13504,54 @@
                 <w:sz w:val="17"/>
               </w:rPr>
               <w:t xml:space="preserve">reports/figures/*.png</w:t>
+            </w:r>
+          </w:p>
+        </w:tc>
+      </w:tr>
+      <w:tr>
+        <w:tc>
+          <w:tcPr/>
+          <w:p>
+            <w:pPr>
+              <w:pStyle w:val="Compact"/>
+              <w:spacing w:after="20"/>
+            </w:pPr>
+            <w:r>
+              <w:rPr>
+                <w:sz w:val="17"/>
+              </w:rPr>
+              <w:t xml:space="preserve">Interactive calculator in the browser</w:t>
+            </w:r>
+          </w:p>
+        </w:tc>
+        <w:tc>
+          <w:tcPr/>
+          <w:p>
+            <w:pPr>
+              <w:pStyle w:val="Compact"/>
+              <w:spacing w:after="20"/>
+            </w:pPr>
+            <w:r>
+              <w:rPr>
+                <w:rStyle w:val="VerbatimChar"/>
+                <w:sz w:val="17"/>
+              </w:rPr>
+              <w:t xml:space="preserve">python -m overtake.app</w:t>
+            </w:r>
+          </w:p>
+        </w:tc>
+        <w:tc>
+          <w:tcPr/>
+          <w:p>
+            <w:pPr>
+              <w:pStyle w:val="Compact"/>
+              <w:spacing w:after="20"/>
+            </w:pPr>
+            <w:r>
+              <w:rPr>
+                <w:sz w:val="17"/>
+              </w:rPr>
+              <w:t xml:space="preserve">page at http://127.0.0.1:8000</w:t>
             </w:r>
           </w:p>
         </w:tc>

</xml_diff>

<commit_message>
Add the AI-use reflection to the report
Section 8 now has the student's reflection; the disclosure is condensed to a paragraph that names the sources the student directed the AI to (Kaggle, OpenF1). Baseline-tuning and crossing details moved to Appendix A and a few paragraphs tightened so Sections 1-8 still fit ten pages. PDF and Word copies rebuilt.
</commit_message>
<xml_diff>
--- a/docs/project_documentation.docx
+++ b/docs/project_documentation.docx
@@ -398,31 +398,19 @@
         <w:t xml:space="preserve"> </w:t>
       </w:r>
       <w:r>
-        <w:t xml:space="preserve">across the lap; driver skill is one rating; safety cars and damage are out of</w:t>
-      </w:r>
-      <w:r>
-        <w:t xml:space="preserve"> </w:t>
-      </w:r>
-      <w:r>
-        <w:t xml:space="preserve">scope. Battery charge and Boost use are not in public timing data, so the</w:t>
-      </w:r>
-      <w:r>
-        <w:t xml:space="preserve"> </w:t>
-      </w:r>
-      <w:r>
-        <w:t xml:space="preserve">training data are simulated and the network can only be as right as the</w:t>
-      </w:r>
-      <w:r>
-        <w:t xml:space="preserve"> </w:t>
-      </w:r>
-      <w:r>
-        <w:t xml:space="preserve">simulator. In return the ground truth is exact, which makes rigorous</w:t>
-      </w:r>
-      <w:r>
-        <w:t xml:space="preserve"> </w:t>
-      </w:r>
-      <w:r>
-        <w:t xml:space="preserve">validation possible.</w:t>
+        <w:t xml:space="preserve">across the lap; safety cars and damage are out of scope. Battery and Boost use</w:t>
+      </w:r>
+      <w:r>
+        <w:t xml:space="preserve"> </w:t>
+      </w:r>
+      <w:r>
+        <w:t xml:space="preserve">are not in public data, so training data are simulated and the network is only</w:t>
+      </w:r>
+      <w:r>
+        <w:t xml:space="preserve"> </w:t>
+      </w:r>
+      <w:r>
+        <w:t xml:space="preserve">as right as the simulator; in return the ground truth is exact.</w:t>
       </w:r>
     </w:p>
     <w:bookmarkEnd w:id="11"/>
@@ -4409,19 +4397,13 @@
         <w:t xml:space="preserve"> </w:t>
       </w:r>
       <w:r>
-        <w:t xml:space="preserve">has one module per stage (schema, physics, simulator,</w:t>
-      </w:r>
-      <w:r>
-        <w:t xml:space="preserve"> </w:t>
-      </w:r>
-      <w:r>
-        <w:t xml:space="preserve">network, training, baselines, prediction, experiments, figures, export, real</w:t>
-      </w:r>
-      <w:r>
-        <w:t xml:space="preserve"> </w:t>
-      </w:r>
-      <w:r>
-        <w:t xml:space="preserve">data); 88 pytest tests cover the numerics, pipeline and notebooks, and</w:t>
+        <w:t xml:space="preserve">has one module per stage; 88 pytest tests cover the</w:t>
+      </w:r>
+      <w:r>
+        <w:t xml:space="preserve"> </w:t>
+      </w:r>
+      <w:r>
+        <w:t xml:space="preserve">numerics, pipeline and notebooks;</w:t>
       </w:r>
       <w:r>
         <w:t xml:space="preserve"> </w:t>
@@ -4430,13 +4412,13 @@
         <w:rPr>
           <w:rStyle w:val="VerbatimChar"/>
         </w:rPr>
-        <w:t xml:space="preserve">notebooks/network_by_hand.ipynb</w:t>
-      </w:r>
-      <w:r>
-        <w:t xml:space="preserve"> </w:t>
-      </w:r>
-      <w:r>
-        <w:t xml:space="preserve">reproduces a prediction step by step.</w:t>
+        <w:t xml:space="preserve">python -m overtake.train</w:t>
+      </w:r>
+      <w:r>
+        <w:t xml:space="preserve"> </w:t>
+      </w:r>
+      <w:r>
+        <w:t xml:space="preserve">and</w:t>
       </w:r>
       <w:r>
         <w:t xml:space="preserve"> </w:t>
@@ -4445,28 +4427,19 @@
         <w:rPr>
           <w:rStyle w:val="VerbatimChar"/>
         </w:rPr>
-        <w:t xml:space="preserve">python -m overtake.train</w:t>
-      </w:r>
-      <w:r>
-        <w:t xml:space="preserve"> </w:t>
-      </w:r>
-      <w:r>
-        <w:t xml:space="preserve">and</w:t>
-      </w:r>
-      <w:r>
-        <w:t xml:space="preserve"> </w:t>
-      </w:r>
-      <w:r>
-        <w:rPr>
-          <w:rStyle w:val="VerbatimChar"/>
-        </w:rPr>
         <w:t xml:space="preserve">python -m overtake.experiments all</w:t>
       </w:r>
       <w:r>
         <w:t xml:space="preserve"> </w:t>
       </w:r>
       <w:r>
-        <w:t xml:space="preserve">regenerate every result; work was done on Git feature branches merged into</w:t>
+        <w:t xml:space="preserve">regenerate every result; work was done</w:t>
+      </w:r>
+      <w:r>
+        <w:t xml:space="preserve"> </w:t>
+      </w:r>
+      <w:r>
+        <w:t xml:space="preserve">on Git feature branches merged into</w:t>
       </w:r>
       <w:r>
         <w:t xml:space="preserve"> </w:t>
@@ -4702,68 +4675,6 @@
                 <w:sz w:val="17"/>
               </w:rPr>
               <w:t xml:space="preserve">RK4</w:t>
-            </w:r>
-          </w:p>
-        </w:tc>
-      </w:tr>
-      <w:tr>
-        <w:tc>
-          <w:tcPr/>
-          <w:p>
-            <w:pPr>
-              <w:pStyle w:val="Compact"/>
-              <w:spacing w:after="20"/>
-            </w:pPr>
-            <w:r>
-              <w:rPr>
-                <w:sz w:val="17"/>
-              </w:rPr>
-              <w:t xml:space="preserve">Hermite crossing</w:t>
-            </w:r>
-          </w:p>
-        </w:tc>
-        <w:tc>
-          <w:tcPr/>
-          <w:p>
-            <w:pPr>
-              <w:pStyle w:val="Compact"/>
-              <w:spacing w:after="20"/>
-            </w:pPr>
-            <w:r>
-              <w:rPr>
-                <w:sz w:val="17"/>
-              </w:rPr>
-              <w:t xml:space="preserve">Straight-line interpolation</w:t>
-            </w:r>
-          </w:p>
-        </w:tc>
-        <w:tc>
-          <w:tcPr/>
-          <w:p>
-            <w:pPr>
-              <w:pStyle w:val="Compact"/>
-              <w:spacing w:after="20"/>
-            </w:pPr>
-            <w:r>
-              <w:rPr>
-                <w:sz w:val="17"/>
-              </w:rPr>
-              <w:t xml:space="preserve">0.059 against 0.20 ms at 0.05 s, same cost</w:t>
-            </w:r>
-          </w:p>
-        </w:tc>
-        <w:tc>
-          <w:tcPr/>
-          <w:p>
-            <w:pPr>
-              <w:pStyle w:val="Compact"/>
-              <w:spacing w:after="20"/>
-            </w:pPr>
-            <w:r>
-              <w:rPr>
-                <w:sz w:val="17"/>
-              </w:rPr>
-              <w:t xml:space="preserve">Hermite</w:t>
             </w:r>
           </w:p>
         </w:tc>
@@ -5700,31 +5611,13 @@
         <w:t xml:space="preserve"> </w:t>
       </w:r>
       <w:r>
-        <w:t xml:space="preserve">poorly. Neither baseline was handicapped: of nine gradient-boosting settings</w:t>
-      </w:r>
-      <w:r>
-        <w:t xml:space="preserve"> </w:t>
-      </w:r>
-      <w:r>
-        <w:t xml:space="preserve">the one used (up to 500 trees with early stopping, learning rate 0.1,</w:t>
-      </w:r>
-      <w:r>
-        <w:t xml:space="preserve"> </w:t>
-      </w:r>
-      <w:r>
-        <w:t xml:space="preserve">31 leaves) was best on validation data (3.7 points, others up to 4.2), and</w:t>
-      </w:r>
-      <w:r>
-        <w:t xml:space="preserve"> </w:t>
-      </w:r>
-      <w:r>
-        <w:t xml:space="preserve">logistic regression is insensitive to its penalty (15.5 points for</w:t>
-      </w:r>
-      <w:r>
-        <w:t xml:space="preserve"> </w:t>
-      </w:r>
-      <w:r>
-        <w:t xml:space="preserve">C = 0.1-10). Direct simulation is exact but 20 times slower, and can use real</w:t>
+        <w:t xml:space="preserve">poorly. Neither baseline was handicapped by its settings (Appendix A).</w:t>
+      </w:r>
+      <w:r>
+        <w:t xml:space="preserve"> </w:t>
+      </w:r>
+      <w:r>
+        <w:t xml:space="preserve">Direct simulation is exact but 20 times slower, and can use real</w:t>
       </w:r>
       <w:r>
         <w:t xml:space="preserve"> </w:t>
@@ -7338,19 +7231,13 @@
         <w:pStyle w:val="FirstParagraph"/>
       </w:pPr>
       <w:r>
-        <w:t xml:space="preserve">Varying one input at a time (Figure A9), the network moves the same way as</w:t>
-      </w:r>
-      <w:r>
-        <w:t xml:space="preserve"> </w:t>
-      </w:r>
-      <w:r>
-        <w:t xml:space="preserve">the simulator for every input; the gap, the straight’s length, both batteries</w:t>
-      </w:r>
-      <w:r>
-        <w:t xml:space="preserve"> </w:t>
-      </w:r>
-      <w:r>
-        <w:t xml:space="preserve">and Boost matter most. Of the estimated constants (Figure A10), the</w:t>
+        <w:t xml:space="preserve">The network moves the same way as the simulator for every input (Figure A9);</w:t>
+      </w:r>
+      <w:r>
+        <w:t xml:space="preserve"> </w:t>
+      </w:r>
+      <w:r>
+        <w:t xml:space="preserve">gap, straight length, batteries and Boost matter most. Of the estimated constants (Figure A10), the</w:t>
       </w:r>
       <w:r>
         <w:t xml:space="preserve"> </w:t>
@@ -7410,25 +7297,19 @@
         <w:pStyle w:val="FirstParagraph"/>
       </w:pPr>
       <w:r>
-        <w:t xml:space="preserve">The convergence study exposed a modelling error and, with the stability</w:t>
-      </w:r>
-      <w:r>
-        <w:t xml:space="preserve"> </w:t>
-      </w:r>
-      <w:r>
-        <w:t xml:space="preserve">study, set the step; validation log loss with the one-standard-error rule</w:t>
-      </w:r>
-      <w:r>
-        <w:t xml:space="preserve"> </w:t>
-      </w:r>
-      <w:r>
-        <w:t xml:space="preserve">[14] chose the network size; five-seed comparisons chose the ensemble and</w:t>
-      </w:r>
-      <w:r>
-        <w:t xml:space="preserve"> </w:t>
-      </w:r>
-      <w:r>
-        <w:t xml:space="preserve">rejected physics-informed inputs; real data was kept out of tuning.</w:t>
+        <w:t xml:space="preserve">Validation set the step (convergence and stability studies), the network size</w:t>
+      </w:r>
+      <w:r>
+        <w:t xml:space="preserve"> </w:t>
+      </w:r>
+      <w:r>
+        <w:t xml:space="preserve">(one-standard-error rule [14]) and the ensemble and inputs (five seeds); real</w:t>
+      </w:r>
+      <w:r>
+        <w:t xml:space="preserve"> </w:t>
+      </w:r>
+      <w:r>
+        <w:t xml:space="preserve">data was kept out of tuning.</w:t>
       </w:r>
       <w:r>
         <w:t xml:space="preserve"> </w:t>
@@ -8106,79 +7987,61 @@
         <w:t xml:space="preserve"> </w:t>
       </w:r>
       <w:r>
-        <w:t xml:space="preserve">One ensemble prediction costs 66,565</w:t>
-      </w:r>
-      <w:r>
-        <w:t xml:space="preserve"> </w:t>
-      </w:r>
-      <w:r>
-        <w:t xml:space="preserve">FLOPs (from the layer sizes) and one simulation about 68,600 (153 RK4 steps of</w:t>
-      </w:r>
-      <w:r>
-        <w:t xml:space="preserve"> </w:t>
-      </w:r>
-      <w:r>
-        <w:t xml:space="preserve">about 444 hand-counted FLOPs, plus the quadrature), yet the network’s forward</w:t>
-      </w:r>
-      <w:r>
-        <w:t xml:space="preserve"> </w:t>
-      </w:r>
-      <w:r>
-        <w:t xml:space="preserve">pass is about 58 times faster (2.2 against 130 µs; with input checks, 20 times,</w:t>
-      </w:r>
-      <w:r>
-        <w:t xml:space="preserve"> </w:t>
-      </w:r>
-      <w:r>
-        <w:t xml:space="preserve">Table 4). The difference is mostly arithmetic intensity: dense matrix products</w:t>
-      </w:r>
-      <w:r>
-        <w:t xml:space="preserve"> </w:t>
-      </w:r>
-      <w:r>
-        <w:t xml:space="preserve">reuse each weight for every scenario in a batch, so intensity rises from 0.5</w:t>
-      </w:r>
-      <w:r>
-        <w:t xml:space="preserve"> </w:t>
-      </w:r>
-      <w:r>
-        <w:t xml:space="preserve">FLOP/byte for one prediction (memory-bound) to 446 at a batch of 10,000, where</w:t>
-      </w:r>
-      <w:r>
-        <w:t xml:space="preserve"> </w:t>
-      </w:r>
-      <w:r>
-        <w:t xml:space="preserve">the ensemble runs at 30 GFLOP/s (compute-bound). The simulator’s element-wise</w:t>
-      </w:r>
-      <w:r>
-        <w:t xml:space="preserve"> </w:t>
-      </w:r>
-      <w:r>
-        <w:t xml:space="preserve">float64 operations move about 24 bytes per FLOP, so its 0.5 GFLOP/s is limited</w:t>
-      </w:r>
-      <w:r>
-        <w:t xml:space="preserve"> </w:t>
-      </w:r>
-      <w:r>
-        <w:t xml:space="preserve">by memory traffic; PyTorch also uses all threads, NumPy’s element-wise</w:t>
-      </w:r>
-      <w:r>
-        <w:t xml:space="preserve"> </w:t>
-      </w:r>
-      <w:r>
-        <w:t xml:space="preserve">operations one. Memory is modest: 132 kB for the ensemble, a peak of 12 MB per</w:t>
-      </w:r>
-      <w:r>
-        <w:t xml:space="preserve"> </w:t>
-      </w:r>
-      <w:r>
-        <w:t xml:space="preserve">20,000-scenario chunk (tracemalloc) and 115 MB for the dataset; chunking caps</w:t>
-      </w:r>
-      <w:r>
-        <w:t xml:space="preserve"> </w:t>
-      </w:r>
-      <w:r>
-        <w:t xml:space="preserve">the simulator’s memory.</w:t>
+        <w:t xml:space="preserve">An ensemble prediction costs 66,565 FLOPs</w:t>
+      </w:r>
+      <w:r>
+        <w:t xml:space="preserve"> </w:t>
+      </w:r>
+      <w:r>
+        <w:t xml:space="preserve">and a simulation about 68,600 (153 RK4 steps of about 444 hand-counted FLOPs,</w:t>
+      </w:r>
+      <w:r>
+        <w:t xml:space="preserve"> </w:t>
+      </w:r>
+      <w:r>
+        <w:t xml:space="preserve">plus quadrature), yet the network’s forward pass is about 58 times faster</w:t>
+      </w:r>
+      <w:r>
+        <w:t xml:space="preserve"> </w:t>
+      </w:r>
+      <w:r>
+        <w:t xml:space="preserve">(2.2 against 130 µs; 20 times with input checks). Dense matrix products reuse</w:t>
+      </w:r>
+      <w:r>
+        <w:t xml:space="preserve"> </w:t>
+      </w:r>
+      <w:r>
+        <w:t xml:space="preserve">each weight across a batch, so intensity rises from 0.5 FLOP/byte for one</w:t>
+      </w:r>
+      <w:r>
+        <w:t xml:space="preserve"> </w:t>
+      </w:r>
+      <w:r>
+        <w:t xml:space="preserve">prediction (memory-bound) to 446 at 10,000, where the ensemble runs at</w:t>
+      </w:r>
+      <w:r>
+        <w:t xml:space="preserve"> </w:t>
+      </w:r>
+      <w:r>
+        <w:t xml:space="preserve">30 GFLOP/s; the simulator’s float64 element-wise operations move about 24 bytes</w:t>
+      </w:r>
+      <w:r>
+        <w:t xml:space="preserve"> </w:t>
+      </w:r>
+      <w:r>
+        <w:t xml:space="preserve">per FLOP, so its 0.5 GFLOP/s is memory-bound, and NumPy uses one thread where</w:t>
+      </w:r>
+      <w:r>
+        <w:t xml:space="preserve"> </w:t>
+      </w:r>
+      <w:r>
+        <w:t xml:space="preserve">PyTorch uses all. Memory: 132 kB ensemble, 12 MB peak per 20,000-scenario</w:t>
+      </w:r>
+      <w:r>
+        <w:t xml:space="preserve"> </w:t>
+      </w:r>
+      <w:r>
+        <w:t xml:space="preserve">chunk (tracemalloc), 115 MB dataset; chunking caps the simulator’s memory.</w:t>
       </w:r>
     </w:p>
     <w:p>
@@ -8242,25 +8105,19 @@
         <w:t xml:space="preserve"> </w:t>
       </w:r>
       <w:r>
-        <w:t xml:space="preserve">constants, one straight, a simple driver model, no labelled real attempts),</w:t>
-      </w:r>
-      <w:r>
-        <w:t xml:space="preserve"> </w:t>
-      </w:r>
-      <w:r>
-        <w:t xml:space="preserve">and real races show it too optimistic from 0.5-1 s behind. The network is</w:t>
-      </w:r>
-      <w:r>
-        <w:t xml:space="preserve"> </w:t>
-      </w:r>
-      <w:r>
-        <w:t xml:space="preserve">less accurate for rare combinations, beyond its training range and along the</w:t>
-      </w:r>
-      <w:r>
-        <w:t xml:space="preserve"> </w:t>
-      </w:r>
-      <w:r>
-        <w:t xml:space="preserve">battery axis.</w:t>
+        <w:t xml:space="preserve">constants, one straight, a simple driver model), and real races show it too</w:t>
+      </w:r>
+      <w:r>
+        <w:t xml:space="preserve"> </w:t>
+      </w:r>
+      <w:r>
+        <w:t xml:space="preserve">optimistic from 0.5-1 s behind; the network is weakest for rare combinations,</w:t>
+      </w:r>
+      <w:r>
+        <w:t xml:space="preserve"> </w:t>
+      </w:r>
+      <w:r>
+        <w:t xml:space="preserve">beyond its training range and along the battery axis.</w:t>
       </w:r>
     </w:p>
     <w:p>
@@ -8454,337 +8311,67 @@
         <w:pStyle w:val="FirstParagraph"/>
       </w:pPr>
       <w:r>
-        <w:t xml:space="preserve">Claude Code (Anthropic) was used throughout, first in a cloud session and</w:t>
-      </w:r>
-      <w:r>
-        <w:t xml:space="preserve"> </w:t>
-      </w:r>
-      <w:r>
-        <w:t xml:space="preserve">then in a local one.</w:t>
-      </w:r>
-    </w:p>
-    <w:tbl>
-      <w:tblPr>
-        <w:tblStyle w:val="Table"/>
-        <w:tblW w:type="pct" w:w="5000"/>
-        <w:tblLayout w:type="fixed"/>
-        <w:tblLook w:firstRow="1" w:lastRow="0" w:firstColumn="0" w:lastColumn="0" w:noHBand="0" w:noVBand="0" w:val="0020"/>
-      </w:tblPr>
-      <w:tblGrid>
-        <w:gridCol w:w="2640"/>
-        <w:gridCol w:w="2640"/>
-        <w:gridCol w:w="2640"/>
-      </w:tblGrid>
-      <w:tr>
-        <w:trPr>
-          <w:tblHeader w:val="on"/>
-        </w:trPr>
-        <w:tc>
-          <w:tcPr/>
-          <w:p>
-            <w:pPr>
-              <w:pStyle w:val="Compact"/>
-              <w:spacing w:after="20"/>
-            </w:pPr>
-            <w:r>
-              <w:rPr>
-                <w:sz w:val="17"/>
-              </w:rPr>
-              <w:t xml:space="preserve">Task</w:t>
-            </w:r>
-          </w:p>
-        </w:tc>
-        <w:tc>
-          <w:tcPr/>
-          <w:p>
-            <w:pPr>
-              <w:pStyle w:val="Compact"/>
-              <w:spacing w:after="20"/>
-            </w:pPr>
-            <w:r>
-              <w:rPr>
-                <w:sz w:val="17"/>
-              </w:rPr>
-              <w:t xml:space="preserve">What the AI did</w:t>
-            </w:r>
-          </w:p>
-        </w:tc>
-        <w:tc>
-          <w:tcPr/>
-          <w:p>
-            <w:pPr>
-              <w:pStyle w:val="Compact"/>
-              <w:spacing w:after="20"/>
-            </w:pPr>
-            <w:r>
-              <w:rPr>
-                <w:sz w:val="17"/>
-              </w:rPr>
-              <w:t xml:space="preserve">How it was checked</w:t>
-            </w:r>
-          </w:p>
-        </w:tc>
-      </w:tr>
-      <w:tr>
-        <w:tc>
-          <w:tcPr/>
-          <w:p>
-            <w:pPr>
-              <w:pStyle w:val="Compact"/>
-              <w:spacing w:after="20"/>
-            </w:pPr>
-            <w:r>
-              <w:rPr>
-                <w:sz w:val="17"/>
-              </w:rPr>
-              <w:t xml:space="preserve">Rules research</w:t>
-            </w:r>
-          </w:p>
-        </w:tc>
-        <w:tc>
-          <w:tcPr/>
-          <w:p>
-            <w:pPr>
-              <w:pStyle w:val="Compact"/>
-              <w:spacing w:after="20"/>
-            </w:pPr>
-            <w:r>
-              <w:rPr>
-                <w:sz w:val="17"/>
-              </w:rPr>
-              <w:t xml:space="preserve">Summarised the 2026 rules; flagged conflicting reports</w:t>
-            </w:r>
-          </w:p>
-        </w:tc>
-        <w:tc>
-          <w:tcPr/>
-          <w:p>
-            <w:pPr>
-              <w:pStyle w:val="Compact"/>
-              <w:spacing w:after="20"/>
-            </w:pPr>
-            <w:r>
-              <w:rPr>
-                <w:sz w:val="17"/>
-              </w:rPr>
-              <w:t xml:space="preserve">Sources in the references</w:t>
-            </w:r>
-          </w:p>
-        </w:tc>
-      </w:tr>
-      <w:tr>
-        <w:tc>
-          <w:tcPr/>
-          <w:p>
-            <w:pPr>
-              <w:pStyle w:val="Compact"/>
-              <w:spacing w:after="20"/>
-            </w:pPr>
-            <w:r>
-              <w:rPr>
-                <w:sz w:val="17"/>
-              </w:rPr>
-              <w:t xml:space="preserve">Physics, numerics, network, experiments</w:t>
-            </w:r>
-          </w:p>
-        </w:tc>
-        <w:tc>
-          <w:tcPr/>
-          <w:p>
-            <w:pPr>
-              <w:pStyle w:val="Compact"/>
-              <w:spacing w:after="20"/>
-            </w:pPr>
-            <w:r>
-              <w:rPr>
-                <w:sz w:val="17"/>
-              </w:rPr>
-              <w:t xml:space="preserve">Wrote the code, figures and tests</w:t>
-            </w:r>
-          </w:p>
-        </w:tc>
-        <w:tc>
-          <w:tcPr/>
-          <w:p>
-            <w:pPr>
-              <w:pStyle w:val="Compact"/>
-              <w:spacing w:after="20"/>
-            </w:pPr>
-            <w:r>
-              <w:rPr>
-                <w:sz w:val="17"/>
-              </w:rPr>
-              <w:t xml:space="preserve">88 tests; exact-solution, convergence and stability studies; numbers regenerated by code</w:t>
-            </w:r>
-          </w:p>
-        </w:tc>
-      </w:tr>
-      <w:tr>
-        <w:tc>
-          <w:tcPr/>
-          <w:p>
-            <w:pPr>
-              <w:pStyle w:val="Compact"/>
-              <w:spacing w:after="20"/>
-            </w:pPr>
-            <w:r>
-              <w:rPr>
-                <w:sz w:val="17"/>
-              </w:rPr>
-              <w:t xml:space="preserve">Real-data comparison</w:t>
-            </w:r>
-          </w:p>
-        </w:tc>
-        <w:tc>
-          <w:tcPr/>
-          <w:p>
-            <w:pPr>
-              <w:pStyle w:val="Compact"/>
-              <w:spacing w:after="20"/>
-            </w:pPr>
-            <w:r>
-              <w:rPr>
-                <w:sz w:val="17"/>
-              </w:rPr>
-              <w:t xml:space="preserve">Found OpenF1; wrote download, filters, comparison</w:t>
-            </w:r>
-          </w:p>
-        </w:tc>
-        <w:tc>
-          <w:tcPr/>
-          <w:p>
-            <w:pPr>
-              <w:pStyle w:val="Compact"/>
-              <w:spacing w:after="20"/>
-            </w:pPr>
-            <w:r>
-              <w:rPr>
-                <w:sz w:val="17"/>
-              </w:rPr>
-              <w:t xml:space="preserve">Filters tested on hand-made races; passes traced to raw data</w:t>
-            </w:r>
-          </w:p>
-        </w:tc>
-      </w:tr>
-      <w:tr>
-        <w:tc>
-          <w:tcPr/>
-          <w:p>
-            <w:pPr>
-              <w:pStyle w:val="Compact"/>
-              <w:spacing w:after="20"/>
-            </w:pPr>
-            <w:r>
-              <w:rPr>
-                <w:sz w:val="17"/>
-              </w:rPr>
-              <w:t xml:space="preserve">Review</w:t>
-            </w:r>
-          </w:p>
-        </w:tc>
-        <w:tc>
-          <w:tcPr/>
-          <w:p>
-            <w:pPr>
-              <w:pStyle w:val="Compact"/>
-              <w:spacing w:after="20"/>
-            </w:pPr>
-            <w:r>
-              <w:rPr>
-                <w:sz w:val="17"/>
-              </w:rPr>
-              <w:t xml:space="preserve">Audited the project against the brief</w:t>
-            </w:r>
-          </w:p>
-        </w:tc>
-        <w:tc>
-          <w:tcPr/>
-          <w:p>
-            <w:pPr>
-              <w:pStyle w:val="Compact"/>
-              <w:spacing w:after="20"/>
-            </w:pPr>
-            <w:r>
-              <w:rPr>
-                <w:sz w:val="17"/>
-              </w:rPr>
-              <w:t xml:space="preserve">Each finding re-checked by a second agent and by running code</w:t>
-            </w:r>
-          </w:p>
-        </w:tc>
-      </w:tr>
-      <w:tr>
-        <w:tc>
-          <w:tcPr/>
-          <w:p>
-            <w:pPr>
-              <w:pStyle w:val="Compact"/>
-              <w:spacing w:after="20"/>
-            </w:pPr>
-            <w:r>
-              <w:rPr>
-                <w:sz w:val="17"/>
-              </w:rPr>
-              <w:t xml:space="preserve">Documentation, presentation</w:t>
-            </w:r>
-          </w:p>
-        </w:tc>
-        <w:tc>
-          <w:tcPr/>
-          <w:p>
-            <w:pPr>
-              <w:pStyle w:val="Compact"/>
-              <w:spacing w:after="20"/>
-            </w:pPr>
-            <w:r>
-              <w:rPr>
-                <w:sz w:val="17"/>
-              </w:rPr>
-              <w:t xml:space="preserve">Drafted this report, slides and notes</w:t>
-            </w:r>
-          </w:p>
-        </w:tc>
-        <w:tc>
-          <w:tcPr/>
-          <w:p>
-            <w:pPr>
-              <w:pStyle w:val="Compact"/>
-              <w:spacing w:after="20"/>
-            </w:pPr>
-            <w:r>
-              <w:rPr>
-                <w:sz w:val="17"/>
-              </w:rPr>
-              <w:t xml:space="preserve">Checked against the results files</w:t>
-            </w:r>
-          </w:p>
-        </w:tc>
-      </w:tr>
-    </w:tbl>
-    <w:p>
-      <w:pPr>
-        <w:pStyle w:val="BodyText"/>
-      </w:pPr>
-      <w:r>
-        <w:t xml:space="preserve">AI errors caught: a simulator too crude for the unit, a slipstream</w:t>
-      </w:r>
-      <w:r>
-        <w:t xml:space="preserve"> </w:t>
-      </w:r>
-      <w:r>
-        <w:t xml:space="preserve">discontinuity, a stability argument that missed the battery ramp, two wrong</w:t>
-      </w:r>
-      <w:r>
-        <w:t xml:space="preserve"> </w:t>
-      </w:r>
-      <w:r>
-        <w:t xml:space="preserve">diagnoses of the full-battery bias, wrong test expectations, a filter</w:t>
-      </w:r>
-      <w:r>
-        <w:t xml:space="preserve"> </w:t>
-      </w:r>
-      <w:r>
-        <w:t xml:space="preserve">counting safety-car position changes, and an unsourced wrong speed.</w:t>
+        <w:t xml:space="preserve">Claude Code (Anthropic) was used throughout, first in a cloud session and then</w:t>
+      </w:r>
+      <w:r>
+        <w:t xml:space="preserve"> </w:t>
+      </w:r>
+      <w:r>
+        <w:t xml:space="preserve">a local one. It summarised the 2026 rules; wrote the code, figures and 88</w:t>
+      </w:r>
+      <w:r>
+        <w:t xml:space="preserve"> </w:t>
+      </w:r>
+      <w:r>
+        <w:t xml:space="preserve">tests; researched the current-season sources I named (Kaggle, OpenF1) and</w:t>
+      </w:r>
+      <w:r>
+        <w:t xml:space="preserve"> </w:t>
+      </w:r>
+      <w:r>
+        <w:t xml:space="preserve">built the OpenF1 comparison; audited the project against the brief; and</w:t>
+      </w:r>
+      <w:r>
+        <w:t xml:space="preserve"> </w:t>
+      </w:r>
+      <w:r>
+        <w:t xml:space="preserve">drafted this report and the slides. Its work was checked by the tests, the</w:t>
+      </w:r>
+      <w:r>
+        <w:t xml:space="preserve"> </w:t>
+      </w:r>
+      <w:r>
+        <w:t xml:space="preserve">exact-solution, convergence and stability studies, regenerating every number</w:t>
+      </w:r>
+      <w:r>
+        <w:t xml:space="preserve"> </w:t>
+      </w:r>
+      <w:r>
+        <w:t xml:space="preserve">from code, tracing real passes back to the raw data, and a second agent</w:t>
+      </w:r>
+      <w:r>
+        <w:t xml:space="preserve"> </w:t>
+      </w:r>
+      <w:r>
+        <w:t xml:space="preserve">re-checking each audit finding. Other AI errors caught: a first simulator too</w:t>
+      </w:r>
+      <w:r>
+        <w:t xml:space="preserve"> </w:t>
+      </w:r>
+      <w:r>
+        <w:t xml:space="preserve">crude for the unit, a stability argument that missed the battery ramp, two</w:t>
+      </w:r>
+      <w:r>
+        <w:t xml:space="preserve"> </w:t>
+      </w:r>
+      <w:r>
+        <w:t xml:space="preserve">wrong diagnoses of the full-battery bias, a filter counting safety-car position</w:t>
+      </w:r>
+      <w:r>
+        <w:t xml:space="preserve"> </w:t>
+      </w:r>
+      <w:r>
+        <w:t xml:space="preserve">changes, and an unsourced speed.</w:t>
       </w:r>
     </w:p>
     <w:bookmarkEnd w:id="37"/>
@@ -8802,81 +8389,163 @@
         <w:pStyle w:val="FirstParagraph"/>
       </w:pPr>
       <w:r>
-        <w:rPr>
-          <w:i/>
-          <w:iCs/>
-        </w:rPr>
-        <w:t xml:space="preserve">To be written by Sam in his own words (the brief requires a personal</w:t>
-      </w:r>
-      <w:r>
-        <w:rPr>
-          <w:i/>
-          <w:iCs/>
-        </w:rPr>
-        <w:t xml:space="preserve"> </w:t>
-      </w:r>
-      <w:r>
-        <w:rPr>
-          <w:i/>
-          <w:iCs/>
-        </w:rPr>
-        <w:t xml:space="preserve">reflection). Cover: which tools were used and for what; the approximate level</w:t>
-      </w:r>
-      <w:r>
-        <w:rPr>
-          <w:i/>
-          <w:iCs/>
-        </w:rPr>
-        <w:t xml:space="preserve"> </w:t>
-      </w:r>
-      <w:r>
-        <w:rPr>
-          <w:i/>
-          <w:iCs/>
-        </w:rPr>
-        <w:t xml:space="preserve">of AI contribution; why AI was used for those tasks; how AI-generated material</w:t>
-      </w:r>
-      <w:r>
-        <w:rPr>
-          <w:i/>
-          <w:iCs/>
-        </w:rPr>
-        <w:t xml:space="preserve"> </w:t>
-      </w:r>
-      <w:r>
-        <w:rPr>
-          <w:i/>
-          <w:iCs/>
-        </w:rPr>
-        <w:t xml:space="preserve">was checked; which important decisions remained yours; errors, limitations or</w:t>
-      </w:r>
-      <w:r>
-        <w:rPr>
-          <w:i/>
-          <w:iCs/>
-        </w:rPr>
-        <w:t xml:space="preserve"> </w:t>
-      </w:r>
-      <w:r>
-        <w:rPr>
-          <w:i/>
-          <w:iCs/>
-        </w:rPr>
-        <w:t xml:space="preserve">unhelpful suggestions from the AI; and how AI use affected your understanding</w:t>
-      </w:r>
-      <w:r>
-        <w:rPr>
-          <w:i/>
-          <w:iCs/>
-        </w:rPr>
-        <w:t xml:space="preserve"> </w:t>
-      </w:r>
-      <w:r>
-        <w:rPr>
-          <w:i/>
-          <w:iCs/>
-        </w:rPr>
-        <w:t xml:space="preserve">and workflow.</w:t>
+        <w:t xml:space="preserve">Claude Code was the only AI tool I used. The problem was my idea, as was the</w:t>
+      </w:r>
+      <w:r>
+        <w:t xml:space="preserve"> </w:t>
+      </w:r>
+      <w:r>
+        <w:t xml:space="preserve">decision to use a neural network. My role was to check that the information</w:t>
+      </w:r>
+      <w:r>
+        <w:t xml:space="preserve"> </w:t>
+      </w:r>
+      <w:r>
+        <w:t xml:space="preserve">was correct and within the scope of the project, to fine-tune the AI’s output</w:t>
+      </w:r>
+      <w:r>
+        <w:t xml:space="preserve"> </w:t>
+      </w:r>
+      <w:r>
+        <w:t xml:space="preserve">and to suggest improvements. The AI wrote all of the code, generated the</w:t>
+      </w:r>
+      <w:r>
+        <w:t xml:space="preserve"> </w:t>
+      </w:r>
+      <w:r>
+        <w:t xml:space="preserve">simulated data and formatted everything so it was presentable. I asked it to</w:t>
+      </w:r>
+      <w:r>
+        <w:t xml:space="preserve"> </w:t>
+      </w:r>
+      <w:r>
+        <w:t xml:space="preserve">research data from the current F1 season, from sources such as Kaggle and</w:t>
+      </w:r>
+      <w:r>
+        <w:t xml:space="preserve"> </w:t>
+      </w:r>
+      <w:r>
+        <w:t xml:space="preserve">OpenF1, and it used OpenF1 to cross-check the simulations against real 2026</w:t>
+      </w:r>
+      <w:r>
+        <w:t xml:space="preserve"> </w:t>
+      </w:r>
+      <w:r>
+        <w:t xml:space="preserve">races.</w:t>
+      </w:r>
+    </w:p>
+    <w:p>
+      <w:pPr>
+        <w:pStyle w:val="BodyText"/>
+      </w:pPr>
+      <w:r>
+        <w:t xml:space="preserve">I used AI to bridge the gap between my idea and the final product: my coding</w:t>
+      </w:r>
+      <w:r>
+        <w:t xml:space="preserve"> </w:t>
+      </w:r>
+      <w:r>
+        <w:t xml:space="preserve">knowledge is nowhere near advanced enough to build a neural network on my</w:t>
+      </w:r>
+      <w:r>
+        <w:t xml:space="preserve"> </w:t>
+      </w:r>
+      <w:r>
+        <w:t xml:space="preserve">own. The checks I cared about most were model accuracy and code quality. I</w:t>
+      </w:r>
+      <w:r>
+        <w:t xml:space="preserve"> </w:t>
+      </w:r>
+      <w:r>
+        <w:t xml:space="preserve">trusted the output because I had the AI audit its own work, with multiple</w:t>
+      </w:r>
+      <w:r>
+        <w:t xml:space="preserve"> </w:t>
+      </w:r>
+      <w:r>
+        <w:t xml:space="preserve">agents scanning everything for problems, but it still made mistakes. One was</w:t>
+      </w:r>
+      <w:r>
+        <w:t xml:space="preserve"> </w:t>
+      </w:r>
+      <w:r>
+        <w:t xml:space="preserve">in the slipstream, which switched off instantly when the cars drew level: the</w:t>
+      </w:r>
+      <w:r>
+        <w:t xml:space="preserve"> </w:t>
+      </w:r>
+      <w:r>
+        <w:t xml:space="preserve">jump in drag made RK4 converge at only first order. The time-step study</w:t>
+      </w:r>
+      <w:r>
+        <w:t xml:space="preserve"> </w:t>
+      </w:r>
+      <w:r>
+        <w:t xml:space="preserve">exposed it; fading the slipstream over one car length fixed it.</w:t>
+      </w:r>
+    </w:p>
+    <w:p>
+      <w:pPr>
+        <w:pStyle w:val="BodyText"/>
+      </w:pPr>
+      <w:r>
+        <w:t xml:space="preserve">I had to relearn methods such as RK4, and I researched what F1 drivers weigh</w:t>
+      </w:r>
+      <w:r>
+        <w:t xml:space="preserve"> </w:t>
+      </w:r>
+      <w:r>
+        <w:t xml:space="preserve">up when planning an overtake, so I could judge whether each input’s weighting</w:t>
+      </w:r>
+      <w:r>
+        <w:t xml:space="preserve"> </w:t>
+      </w:r>
+      <w:r>
+        <w:t xml:space="preserve">was acceptable.</w:t>
+      </w:r>
+    </w:p>
+    <w:p>
+      <w:pPr>
+        <w:pStyle w:val="BodyText"/>
+      </w:pPr>
+      <w:r>
+        <w:t xml:space="preserve">Without AI I could not have reached this standard; I would probably have built</w:t>
+      </w:r>
+      <w:r>
+        <w:t xml:space="preserve"> </w:t>
+      </w:r>
+      <w:r>
+        <w:t xml:space="preserve">a basic logistic regression instead of a neural network. The project still</w:t>
+      </w:r>
+      <w:r>
+        <w:t xml:space="preserve"> </w:t>
+      </w:r>
+      <w:r>
+        <w:t xml:space="preserve">deepened my understanding of how prediction models work and what makes them</w:t>
+      </w:r>
+      <w:r>
+        <w:t xml:space="preserve"> </w:t>
+      </w:r>
+      <w:r>
+        <w:t xml:space="preserve">efficient and accurate. Next time I would choose a problem with real, complete</w:t>
+      </w:r>
+      <w:r>
+        <w:t xml:space="preserve"> </w:t>
+      </w:r>
+      <w:r>
+        <w:t xml:space="preserve">data: Boost and Overtake Mode only arrived in 2026, so there was no data with</w:t>
+      </w:r>
+      <w:r>
+        <w:t xml:space="preserve"> </w:t>
+      </w:r>
+      <w:r>
+        <w:t xml:space="preserve">battery and Boost information to train on, and the simulated data may contain</w:t>
+      </w:r>
+      <w:r>
+        <w:t xml:space="preserve"> </w:t>
+      </w:r>
+      <w:r>
+        <w:t xml:space="preserve">inaccuracies.</w:t>
       </w:r>
     </w:p>
     <w:p>
@@ -10486,6 +10155,72 @@
         </w:tc>
       </w:tr>
     </w:tbl>
+    <w:p>
+      <w:pPr>
+        <w:pStyle w:val="BodyText"/>
+      </w:pPr>
+      <w:r>
+        <w:rPr>
+          <w:i/>
+          <w:iCs/>
+        </w:rPr>
+        <w:t xml:space="preserve">Baselines.</w:t>
+      </w:r>
+      <w:r>
+        <w:t xml:space="preserve"> </w:t>
+      </w:r>
+      <w:r>
+        <w:t xml:space="preserve">Of nine gradient-boosting settings (</w:t>
+      </w:r>
+      <w:r>
+        <w:rPr>
+          <w:rStyle w:val="VerbatimChar"/>
+        </w:rPr>
+        <w:t xml:space="preserve">experiments baselines</w:t>
+      </w:r>
+      <w:r>
+        <w:t xml:space="preserve">), the</w:t>
+      </w:r>
+      <w:r>
+        <w:t xml:space="preserve"> </w:t>
+      </w:r>
+      <w:r>
+        <w:t xml:space="preserve">one used (up to 500 trees with early stopping, learning rate 0.1, 31 leaves)</w:t>
+      </w:r>
+      <w:r>
+        <w:t xml:space="preserve"> </w:t>
+      </w:r>
+      <w:r>
+        <w:t xml:space="preserve">was best on validation data (3.7 points, others up to 4.2); logistic</w:t>
+      </w:r>
+      <w:r>
+        <w:t xml:space="preserve"> </w:t>
+      </w:r>
+      <w:r>
+        <w:t xml:space="preserve">regression gives 15.5 points for any penalty C = 0.1-10. Straight-line</w:t>
+      </w:r>
+      <w:r>
+        <w:t xml:space="preserve"> </w:t>
+      </w:r>
+      <w:r>
+        <w:t xml:space="preserve">interpolation at the braking point would give 0.20 ms worst deficit error at</w:t>
+      </w:r>
+      <w:r>
+        <w:t xml:space="preserve"> </w:t>
+      </w:r>
+      <w:r>
+        <w:t xml:space="preserve">0.05 s, against 0.059 ms with the Hermite crossing (</w:t>
+      </w:r>
+      <w:r>
+        <w:rPr>
+          <w:rStyle w:val="VerbatimChar"/>
+        </w:rPr>
+        <w:t xml:space="preserve">experiments timestep</w:t>
+      </w:r>
+      <w:r>
+        <w:t xml:space="preserve">).</w:t>
+      </w:r>
+    </w:p>
     <w:p>
       <w:pPr>
         <w:pStyle w:val="BodyText"/>

</xml_diff>

<commit_message>
Check the model against the current FIA regulations and fix reference 7
The cited FIA document (Issue 4, 2023) is no longer online; reference 7 now
points to the 2026 Technical Regulations, Issue 17 (28 April 2026). Its
Article C5.2.8 tapers MGU-K power without Overtake Mode to zero at 345 km/h,
where the model uses a linear taper to 355 km/h from the 2025 summaries.
The rules experiment now measures the difference with the regulation taper
(fia_issue17_power_limit, tested against the regulation text): 0.16 points
of exact P on average, 47.4 % to 45.7 % at the default scenario. The report
states this in Section 1, Table 2 and Appendix E. 89 tests; API docs, test
report and report PDF/Word regenerated.
</commit_message>
<xml_diff>
--- a/docs/project_documentation.docx
+++ b/docs/project_documentation.docx
@@ -227,19 +227,19 @@
         <w:t xml:space="preserve"> </w:t>
       </w:r>
       <w:r>
-        <w:t xml:space="preserve">than one long straight. Electrical power also tapers from 290 km/h to zero at</w:t>
-      </w:r>
-      <w:r>
-        <w:t xml:space="preserve"> </w:t>
-      </w:r>
-      <w:r>
-        <w:t xml:space="preserve">355 km/h; Overtake Mode, earned within 1 s of the car ahead at a detection</w:t>
-      </w:r>
-      <w:r>
-        <w:t xml:space="preserve"> </w:t>
-      </w:r>
-      <w:r>
-        <w:t xml:space="preserve">point, adds 0.5 MJ and full power to 337 km/h [1-4]. Overtaking has become a</w:t>
+        <w:t xml:space="preserve">than one long straight. Electrical power also tapers above 290 km/h (to zero</w:t>
+      </w:r>
+      <w:r>
+        <w:t xml:space="preserve"> </w:t>
+      </w:r>
+      <w:r>
+        <w:t xml:space="preserve">at 345 km/h [7]); Overtake Mode, earned within 1 s of the car ahead at a</w:t>
+      </w:r>
+      <w:r>
+        <w:t xml:space="preserve"> </w:t>
+      </w:r>
+      <w:r>
+        <w:t xml:space="preserve">detection point, adds 0.5 MJ and full power to 337 km/h [1-4, 7]. Overtaking has become a</w:t>
       </w:r>
       <w:r>
         <w:t xml:space="preserve"> </w:t>
@@ -2237,7 +2237,7 @@
         <w:t xml:space="preserve"> </w:t>
       </w:r>
       <w:r>
-        <w:t xml:space="preserve">falling to zero at 355 km/h (full power to 337 km/h with Overtake Mode); the</w:t>
+        <w:t xml:space="preserve">falling linearly to zero at 355 km/h (Appendix E; full power to 337 km/h with Overtake Mode); the</w:t>
       </w:r>
       <w:r>
         <w:t xml:space="preserve"> </w:t>
@@ -2931,7 +2931,7 @@
               <w:rPr>
                 <w:sz w:val="17"/>
               </w:rPr>
-              <w:t xml:space="preserve">350 kW; 290 → 355 km/h; full power to 337 km/h and +0.5 MJ</w:t>
+              <w:t xml:space="preserve">350 kW; 290 → 355 km/h, linear (simplified, Appendix E); full power to 337 km/h and +0.5 MJ</w:t>
             </w:r>
           </w:p>
         </w:tc>
@@ -4397,7 +4397,7 @@
         <w:t xml:space="preserve"> </w:t>
       </w:r>
       <w:r>
-        <w:t xml:space="preserve">has one module per stage; 88 pytest tests cover the</w:t>
+        <w:t xml:space="preserve">has one module per stage; 89 pytest tests cover the</w:t>
       </w:r>
       <w:r>
         <w:t xml:space="preserve"> </w:t>
@@ -8317,7 +8317,7 @@
         <w:t xml:space="preserve"> </w:t>
       </w:r>
       <w:r>
-        <w:t xml:space="preserve">a local one. It summarised the 2026 rules; wrote the code, figures and 88</w:t>
+        <w:t xml:space="preserve">a local one. It summarised the 2026 rules; wrote the code, figures and 89</w:t>
       </w:r>
       <w:r>
         <w:t xml:space="preserve"> </w:t>
@@ -8771,7 +8771,7 @@
         </w:numPr>
       </w:pPr>
       <w:r>
-        <w:t xml:space="preserve">FIA, 2026 Formula 1 Technical Regulations, Section C (Power Unit), Issue 4, 2023.</w:t>
+        <w:t xml:space="preserve">FIA, 2026 F1 Regulations, Section C: Technical Regulations, Issue 17, 28 April 2026, Article C5.2.</w:t>
       </w:r>
       <w:r>
         <w:t xml:space="preserve"> </w:t>
@@ -8781,7 +8781,7 @@
           <w:rPr>
             <w:rStyle w:val="Hyperlink"/>
           </w:rPr>
-          <w:t xml:space="preserve">https://FIA.com/sites/default/files/fia_2026_formula_1_technical_regulations_pu_-_issue_4_-_2023-10-25.pdf</w:t>
+          <w:t xml:space="preserve">https://www.fia.com/system/files/documents/fia_2026_f1_regulations_-_section_c_technical_-_iss_17_-_2026-04-28.pdf</w:t>
         </w:r>
       </w:hyperlink>
     </w:p>
@@ -13178,6 +13178,72 @@
                 <w:sz w:val="17"/>
               </w:rPr>
               <w:t xml:space="preserve">33 m/s × √(relative grip); 6 % × e^(−gap/1 s)</w:t>
+            </w:r>
+          </w:p>
+        </w:tc>
+      </w:tr>
+      <w:tr>
+        <w:tc>
+          <w:tcPr/>
+          <w:p>
+            <w:pPr>
+              <w:pStyle w:val="Compact"/>
+              <w:spacing w:after="20"/>
+            </w:pPr>
+            <w:r>
+              <w:rPr>
+                <w:sz w:val="17"/>
+              </w:rPr>
+              <w:t xml:space="preserve">Rules</w:t>
+            </w:r>
+          </w:p>
+        </w:tc>
+        <w:tc>
+          <w:tcPr/>
+          <w:p>
+            <w:pPr>
+              <w:pStyle w:val="Compact"/>
+              <w:spacing w:after="20"/>
+            </w:pPr>
+            <w:r>
+              <w:rPr>
+                <w:sz w:val="17"/>
+              </w:rPr>
+              <w:t xml:space="preserve">MGU-K taper without Overtake Mode</w:t>
+            </w:r>
+          </w:p>
+        </w:tc>
+        <w:tc>
+          <w:tcPr/>
+          <w:p>
+            <w:pPr>
+              <w:pStyle w:val="Compact"/>
+              <w:spacing w:after="20"/>
+            </w:pPr>
+            <w:r>
+              <w:rPr>
+                <w:sz w:val="17"/>
+              </w:rPr>
+              <w:t xml:space="preserve">Model: linear from 350 kW at 290 km/h to zero at 355 km/h, from the 2025 rule summaries [1-4]. Regulations, Issue 17 [7]: 1800 − 5v kW (100 kW at 340 km/h), then zero at 345 km/h. With the regulation taper the exact P changes by 0.16 points on average over 3,000 scenarios (default scenario 47.4 % → 45.7 %;</w:t>
+            </w:r>
+            <w:r>
+              <w:rPr>
+                <w:sz w:val="17"/>
+              </w:rPr>
+              <w:t xml:space="preserve"> </w:t>
+            </w:r>
+            <w:r>
+              <w:rPr>
+                <w:rStyle w:val="VerbatimChar"/>
+                <w:sz w:val="17"/>
+              </w:rPr>
+              <w:t xml:space="preserve">experiments rules</w:t>
+            </w:r>
+            <w:r>
+              <w:rPr>
+                <w:sz w:val="17"/>
+              </w:rPr>
+              <w:t xml:space="preserve">)</w:t>
             </w:r>
           </w:p>
         </w:tc>

</xml_diff>